<commit_message>
fix(to-prd): v1.4 독립 검토 반영
- validate_prd: 변경 노트 모드 인식, [평가] SC의 EV 참조, AI 판단 보류 검증 SC, AI 미사용 시 EV 모순, 파생본 부록 C 경고 처리
- render_prd_html: [평가] 라벨 표시
- AI 품질 기준을 AI 과제의 필수 항목으로, 비용 상한 추정 규칙, 확정 판정 대상 목록 통일
- 상태 개수 표기, 15장 두·세 관문, 성공 지표 용어 정리
- 템플릿·핸드북 문구 정리(AI 관련 칸, 성공 기준 분리, 수치 예시)

Co-Authored-By: Claude Opus 5.5 <noreply@anthropic.com>
Claude-Session: https://claude.ai/code/session_01XWSZ7dsTkezJGXzJvFhZzJ
</commit_message>
<xml_diff>
--- a/plugins/to-prd/skills/to-prd/assets/brief/PRD작성핸드북_v1.4.docx
+++ b/plugins/to-prd/skills/to-prd/assets/brief/PRD작성핸드북_v1.4.docx
@@ -57,7 +57,13 @@
     <w:p>
       <w:pPr/>
       <w:r>
-        <w:t>•  완료 기준과 제외 기능: 지금 수치와 목표 수치, 언제 누가 확인할지, 이번에 만들지 않을 것</w:t>
+        <w:t>•  완료 기준과 제외 기능: 반드시 끝까지 되어야 할 업무, 이번에 만들지 않을 것</w:t>
+      </w:r>
+    </w:p>
+    <w:p>
+      <w:pPr/>
+      <w:r>
+        <w:t>•  성공을 확인할 기준: 지금 수치와 목표 수치, 언제 누가 확인할지</w:t>
       </w:r>
     </w:p>
     <w:p>
@@ -77,7 +83,7 @@
     <w:p>
       <w:pPr/>
       <w:r>
-        <w:t>서비스 기사는 점검 결과를 메신저로 보내고 파트장은 이를 확인합니다. 앱에서는 기사가 요청을 등록하고 파트장이 승인합니다. 요청 목록과 상세 화면이 필요하며, 일반 사용자는 본인 요청만 봅니다. 반려 사유를 표시하고, 등록부터 승인까지의 흐름이 끝까지 동작해야 합니다. 고객 자동 발송은 제외합니다.</w:t>
+        <w:t>서비스 기사는 점검 결과를 메신저로 보내고 파트장은 이를 확인합니다. 앱에서는 기사가 요청을 등록하고 파트장이 승인합니다. 요청 목록과 상세 화면이 필요하며, 일반 사용자는 본인 요청만 봅니다. 반려 사유를 표시하고, 등록부터 승인까지의 흐름이 끝까지 동작해야 합니다. 고객 자동 발송은 제외합니다. 접수부터 회신까지 2.6일 걸리던 것을 1일 이내로 줄이는 것이 목표이며, 사용 4주 후 파트장이 확인합니다.</w:t>
       </w:r>
     </w:p>
     <w:p>
@@ -190,7 +196,7 @@
     <w:p>
       <w:pPr/>
       <w:r>
-        <w:t>•  성공 지표를 언제 누가 확인하는지 정해졌는가</w:t>
+        <w:t>•  성공을 확인할 기준에 목표 수치와 언제 누가 확인할지가 들어갔는가</w:t>
       </w:r>
     </w:p>
     <w:p>

</xml_diff>